<commit_message>
Update 30 tracked files: email drafts, Kim docs, host system, ops
Accumulated edits across host comms plan, security routing, Kim
onboarding docs, decision rights matrix, intake form, Airtable API
module, shared view links, and recent email draft revisions.

Co-Authored-By: Claude Opus 4.6 <noreply@anthropic.com>
</commit_message>
<xml_diff>
--- a/kim-onboarding-proposal.docx
+++ b/kim-onboarding-proposal.docx
@@ -81,7 +81,7 @@
           <w:sz w:val="24"/>
           <w:szCs w:val="24"/>
         </w:rPr>
-        <w:t xml:space="preserve">The short version: One Earth Film Fest has run for 15 years. The festival works. What we're missing is the organizational scaffolding that lets people beyond our core team execute confidently. We have an extensive knowledge base and documentation already built. The project is making that usable by everyone.</w:t>
+        <w:t xml:space="preserve">The short version: One Earth Film Fest has run for 15 years. The festival works. What we need is a second person who can operate the host communications system we've built -- and improve it by actually using it. You'd step into the workflow from day one, with documentation happening as a natural output of doing the work.</w:t>
       </w:r>
     </w:p>
     <w:p>
@@ -115,23 +115,23 @@
           <w:sz w:val="24"/>
           <w:szCs w:val="24"/>
         </w:rPr>
-        <w:t xml:space="preserve">Institutional knowledge currently lives in individual inboxes, ad hoc email threads, and undocumented handoffs. We've built strong documentation over the past several months -- runbooks, guides, data architecture, process maps -- but it hasn't been organized for team-wide access or turned into training materials.</w:t>
-      </w:r>
-    </w:p>
-    <w:p>
-      <w:pPr>
-        <w:spacing w:after="200"/>
-        <w:rPr>
-          <w:sz w:val="24"/>
-          <w:szCs w:val="24"/>
-        </w:rPr>
-      </w:pPr>
-      <w:r>
-        <w:rPr>
-          <w:sz w:val="24"/>
-          <w:szCs w:val="24"/>
-        </w:rPr>
-        <w:t xml:space="preserve">When an intern or contractor needs to send an email, update a list, or follow up with a host, there's no clear system to follow. Every task requires someone to explain it from scratch. This creates bottlenecks (3 people fielding everything), inconsistency (different people say different things), and burnout (the same decisions get re-made every cycle).</w:t>
+        <w:t xml:space="preserve">We've built strong infrastructure over the past several months -- a host communications plan with 5 streams, email templates, a dependency map, shared inboxes, a centralized host guide. What we haven't done is hand it to someone and see if it actually works. The documentation was written from the inside. We need someone to operate it from the outside and tell us what's missing.</w:t>
+      </w:r>
+    </w:p>
+    <w:p>
+      <w:pPr>
+        <w:spacing w:after="200"/>
+        <w:rPr>
+          <w:sz w:val="24"/>
+          <w:szCs w:val="24"/>
+        </w:rPr>
+      </w:pPr>
+      <w:r>
+        <w:rPr>
+          <w:sz w:val="24"/>
+          <w:szCs w:val="24"/>
+        </w:rPr>
+        <w:t xml:space="preserve">Right now, host communications run through one person. That's a bottleneck during festival prep and a single point of failure during festival week. We need a second person who can confidently execute the comms plan -- and the best way to test whether the plan is actually executable is to have someone do it.</w:t>
       </w:r>
     </w:p>
     <w:p>
@@ -183,23 +183,23 @@
           <w:sz w:val="26"/>
           <w:szCs w:val="26"/>
         </w:rPr>
-        <w:t xml:space="preserve">Phase 1: Knowledge Base Strategy + Team Onboarding (weeks 1-3)</w:t>
-      </w:r>
-    </w:p>
-    <w:p>
-      <w:pPr>
-        <w:spacing w:after="200"/>
-        <w:rPr>
-          <w:sz w:val="24"/>
-          <w:szCs w:val="24"/>
-        </w:rPr>
-      </w:pPr>
-      <w:r>
-        <w:rPr>
-          <w:sz w:val="24"/>
-          <w:szCs w:val="24"/>
-        </w:rPr>
-        <w:t xml:space="preserve">The first project is working with our existing documentation to create something the whole team can use.</w:t>
+        <w:t xml:space="preserve">Phase 1: Host Communications Onboarding (weeks 1-3)</w:t>
+      </w:r>
+    </w:p>
+    <w:p>
+      <w:pPr>
+        <w:spacing w:after="200"/>
+        <w:rPr>
+          <w:sz w:val="24"/>
+          <w:szCs w:val="24"/>
+        </w:rPr>
+      </w:pPr>
+      <w:r>
+        <w:rPr>
+          <w:sz w:val="24"/>
+          <w:szCs w:val="24"/>
+        </w:rPr>
+        <w:t xml:space="preserve">The first project is stepping into the host communications workflow -- operating it, improving it, and documenting what you learn along the way.</w:t>
       </w:r>
     </w:p>
     <w:p>
@@ -286,144 +286,144 @@
           <w:sz w:val="24"/>
           <w:szCs w:val="24"/>
         </w:rPr>
-        <w:t xml:space="preserve">Step 2 -- Audit the knowledge base:</w:t>
-      </w:r>
-    </w:p>
-    <w:p>
-      <w:pPr>
-        <w:spacing w:after="120"/>
-        <w:ind w:left="720" w:hanging="360"/>
-        <w:rPr>
-          <w:sz w:val="24"/>
-          <w:szCs w:val="24"/>
-        </w:rPr>
-      </w:pPr>
-      <w:r>
-        <w:rPr>
-          <w:sz w:val="24"/>
-          <w:szCs w:val="24"/>
-        </w:rPr>
-        <w:t xml:space="preserve">•  Review what documentation exists (runbooks, guides, process maps)</w:t>
-      </w:r>
-    </w:p>
-    <w:p>
-      <w:pPr>
-        <w:spacing w:after="120"/>
-        <w:ind w:left="720" w:hanging="360"/>
-        <w:rPr>
-          <w:sz w:val="24"/>
-          <w:szCs w:val="24"/>
-        </w:rPr>
-      </w:pPr>
-      <w:r>
-        <w:rPr>
-          <w:sz w:val="24"/>
-          <w:szCs w:val="24"/>
-        </w:rPr>
-        <w:t xml:space="preserve">•  Identify what's missing, what's outdated, and what's not accessible to the right people</w:t>
-      </w:r>
-    </w:p>
-    <w:p>
-      <w:pPr>
-        <w:spacing w:after="120"/>
-        <w:ind w:left="720" w:hanging="360"/>
-        <w:rPr>
-          <w:sz w:val="24"/>
-          <w:szCs w:val="24"/>
-        </w:rPr>
-      </w:pPr>
-      <w:r>
-        <w:rPr>
-          <w:sz w:val="24"/>
-          <w:szCs w:val="24"/>
-        </w:rPr>
-        <w:t xml:space="preserve">•  Map the gap between what we've documented and what the team can actually find and use</w:t>
-      </w:r>
-    </w:p>
-    <w:p>
-      <w:pPr>
-        <w:spacing w:after="100"/>
-        <w:rPr>
-          <w:b/>
-          <w:sz w:val="24"/>
-          <w:szCs w:val="24"/>
-        </w:rPr>
-      </w:pPr>
-      <w:r>
-        <w:rPr>
-          <w:b/>
-          <w:sz w:val="24"/>
-          <w:szCs w:val="24"/>
-        </w:rPr>
-        <w:t xml:space="preserve">Step 3 -- Design the training layer:</w:t>
-      </w:r>
-    </w:p>
-    <w:p>
-      <w:pPr>
-        <w:spacing w:after="120"/>
-        <w:ind w:left="720" w:hanging="360"/>
-        <w:rPr>
-          <w:sz w:val="24"/>
-          <w:szCs w:val="24"/>
-        </w:rPr>
-      </w:pPr>
-      <w:r>
-        <w:rPr>
-          <w:sz w:val="24"/>
-          <w:szCs w:val="24"/>
-        </w:rPr>
-        <w:t xml:space="preserve">•  Propose how to organize documentation for different audiences (staff vs. contractors vs. interns vs. hosts)</w:t>
-      </w:r>
-    </w:p>
-    <w:p>
-      <w:pPr>
-        <w:spacing w:after="120"/>
-        <w:ind w:left="720" w:hanging="360"/>
-        <w:rPr>
-          <w:sz w:val="24"/>
-          <w:szCs w:val="24"/>
-        </w:rPr>
-      </w:pPr>
-      <w:r>
-        <w:rPr>
-          <w:sz w:val="24"/>
-          <w:szCs w:val="24"/>
-        </w:rPr>
-        <w:t xml:space="preserve">•  Create a team onboarding packet: key contacts, tools access, communication norms, role-specific guides</w:t>
-      </w:r>
-    </w:p>
-    <w:p>
-      <w:pPr>
-        <w:spacing w:after="120"/>
-        <w:ind w:left="720" w:hanging="360"/>
-        <w:rPr>
-          <w:sz w:val="24"/>
-          <w:szCs w:val="24"/>
-        </w:rPr>
-      </w:pPr>
-      <w:r>
-        <w:rPr>
-          <w:sz w:val="24"/>
-          <w:szCs w:val="24"/>
-        </w:rPr>
-        <w:t xml:space="preserve">•  Design 1-2 training sessions that walk the team through the systems we've built</w:t>
-      </w:r>
-    </w:p>
-    <w:p>
-      <w:pPr>
-        <w:spacing w:after="120"/>
-        <w:ind w:left="720" w:hanging="360"/>
-        <w:rPr>
-          <w:sz w:val="24"/>
-          <w:szCs w:val="24"/>
-        </w:rPr>
-      </w:pPr>
-      <w:r>
-        <w:rPr>
-          <w:sz w:val="24"/>
-          <w:szCs w:val="24"/>
-        </w:rPr>
-        <w:t xml:space="preserve">•  Build a delegation playbook: step-by-step instructions an intern can follow without asking anyone</w:t>
+        <w:t xml:space="preserve">Step 2 -- Shadow a send cycle:</w:t>
+      </w:r>
+    </w:p>
+    <w:p>
+      <w:pPr>
+        <w:spacing w:after="120"/>
+        <w:ind w:left="720" w:hanging="360"/>
+        <w:rPr>
+          <w:sz w:val="24"/>
+          <w:szCs w:val="24"/>
+        </w:rPr>
+      </w:pPr>
+      <w:r>
+        <w:rPr>
+          <w:sz w:val="24"/>
+          <w:szCs w:val="24"/>
+        </w:rPr>
+        <w:t xml:space="preserve">Watch Garen execute one webinar reminder cycle end-to-end (YAMM merge, sheet update, host guide update)</w:t>
+      </w:r>
+    </w:p>
+    <w:p>
+      <w:pPr>
+        <w:spacing w:after="120"/>
+        <w:ind w:left="720" w:hanging="360"/>
+        <w:rPr>
+          <w:sz w:val="24"/>
+          <w:szCs w:val="24"/>
+        </w:rPr>
+      </w:pPr>
+      <w:r>
+        <w:rPr>
+          <w:sz w:val="24"/>
+          <w:szCs w:val="24"/>
+        </w:rPr>
+        <w:t xml:space="preserve">Read the communications plan and dependency map -- understand the 5 streams, prerequisites, and approval chains</w:t>
+      </w:r>
+    </w:p>
+    <w:p>
+      <w:pPr>
+        <w:spacing w:after="120"/>
+        <w:ind w:left="720" w:hanging="360"/>
+        <w:rPr>
+          <w:sz w:val="24"/>
+          <w:szCs w:val="24"/>
+        </w:rPr>
+      </w:pPr>
+      <w:r>
+        <w:rPr>
+          <w:sz w:val="24"/>
+          <w:szCs w:val="24"/>
+        </w:rPr>
+        <w:t xml:space="preserve">Ask questions async -- build confidence in the workflow before executing it yourself</w:t>
+      </w:r>
+    </w:p>
+    <w:p>
+      <w:pPr>
+        <w:spacing w:after="100"/>
+        <w:rPr>
+          <w:b/>
+          <w:sz w:val="24"/>
+          <w:szCs w:val="24"/>
+        </w:rPr>
+      </w:pPr>
+      <w:r>
+        <w:rPr>
+          <w:b/>
+          <w:sz w:val="24"/>
+          <w:szCs w:val="24"/>
+        </w:rPr>
+        <w:t xml:space="preserve">Step 3 -- Take over and document:</w:t>
+      </w:r>
+    </w:p>
+    <w:p>
+      <w:pPr>
+        <w:spacing w:after="120"/>
+        <w:ind w:left="720" w:hanging="360"/>
+        <w:rPr>
+          <w:sz w:val="24"/>
+          <w:szCs w:val="24"/>
+        </w:rPr>
+      </w:pPr>
+      <w:r>
+        <w:rPr>
+          <w:sz w:val="24"/>
+          <w:szCs w:val="24"/>
+        </w:rPr>
+        <w:t xml:space="preserve">Take over Stream 1 (webinar reminders + recording follow-ups) with Garen as backup</w:t>
+      </w:r>
+    </w:p>
+    <w:p>
+      <w:pPr>
+        <w:spacing w:after="120"/>
+        <w:ind w:left="720" w:hanging="360"/>
+        <w:rPr>
+          <w:sz w:val="24"/>
+          <w:szCs w:val="24"/>
+        </w:rPr>
+      </w:pPr>
+      <w:r>
+        <w:rPr>
+          <w:sz w:val="24"/>
+          <w:szCs w:val="24"/>
+        </w:rPr>
+        <w:t xml:space="preserve">Execute the templates, follow the dependency map, keep a running doc of friction points</w:t>
+      </w:r>
+    </w:p>
+    <w:p>
+      <w:pPr>
+        <w:spacing w:after="120"/>
+        <w:ind w:left="720" w:hanging="360"/>
+        <w:rPr>
+          <w:sz w:val="24"/>
+          <w:szCs w:val="24"/>
+        </w:rPr>
+      </w:pPr>
+      <w:r>
+        <w:rPr>
+          <w:sz w:val="24"/>
+          <w:szCs w:val="24"/>
+        </w:rPr>
+        <w:t xml:space="preserve">Improve templates where you see opportunities -- the process gets better because you're running it</w:t>
+      </w:r>
+    </w:p>
+    <w:p>
+      <w:pPr>
+        <w:spacing w:after="120"/>
+        <w:ind w:left="720" w:hanging="360"/>
+        <w:rPr>
+          <w:sz w:val="24"/>
+          <w:szCs w:val="24"/>
+        </w:rPr>
+      </w:pPr>
+      <w:r>
+        <w:rPr>
+          <w:sz w:val="24"/>
+          <w:szCs w:val="24"/>
+        </w:rPr>
+        <w:t xml:space="preserve">Write down what you needed to know that wasn't documented -- the operator notes become the playbook</w:t>
       </w:r>
     </w:p>
     <w:p>
@@ -458,58 +458,58 @@
           <w:sz w:val="24"/>
           <w:szCs w:val="24"/>
         </w:rPr>
-        <w:t xml:space="preserve">•  Knowledge base audit with recommendations</w:t>
-      </w:r>
-    </w:p>
-    <w:p>
-      <w:pPr>
-        <w:spacing w:after="120"/>
-        <w:ind w:left="720" w:hanging="360"/>
-        <w:rPr>
-          <w:sz w:val="24"/>
-          <w:szCs w:val="24"/>
-        </w:rPr>
-      </w:pPr>
-      <w:r>
-        <w:rPr>
-          <w:sz w:val="24"/>
-          <w:szCs w:val="24"/>
-        </w:rPr>
-        <w:t xml:space="preserve">•  Team onboarding packet</w:t>
-      </w:r>
-    </w:p>
-    <w:p>
-      <w:pPr>
-        <w:spacing w:after="120"/>
-        <w:ind w:left="720" w:hanging="360"/>
-        <w:rPr>
-          <w:sz w:val="24"/>
-          <w:szCs w:val="24"/>
-        </w:rPr>
-      </w:pPr>
-      <w:r>
-        <w:rPr>
-          <w:sz w:val="24"/>
-          <w:szCs w:val="24"/>
-        </w:rPr>
-        <w:t xml:space="preserve">•  Delegation playbook with email templates for recurring communications</w:t>
-      </w:r>
-    </w:p>
-    <w:p>
-      <w:pPr>
-        <w:spacing w:after="120"/>
-        <w:ind w:left="720" w:hanging="360"/>
-        <w:rPr>
-          <w:sz w:val="24"/>
-          <w:szCs w:val="24"/>
-        </w:rPr>
-      </w:pPr>
-      <w:r>
-        <w:rPr>
-          <w:sz w:val="24"/>
-          <w:szCs w:val="24"/>
-        </w:rPr>
-        <w:t xml:space="preserve">•  Training session plan (and facilitation if timing works)</w:t>
+        <w:t xml:space="preserve">Operator notes: a running doc of gaps, assumptions, and things that required asking</w:t>
+      </w:r>
+    </w:p>
+    <w:p>
+      <w:pPr>
+        <w:spacing w:after="120"/>
+        <w:ind w:left="720" w:hanging="360"/>
+        <w:rPr>
+          <w:sz w:val="24"/>
+          <w:szCs w:val="24"/>
+        </w:rPr>
+      </w:pPr>
+      <w:r>
+        <w:rPr>
+          <w:sz w:val="24"/>
+          <w:szCs w:val="24"/>
+        </w:rPr>
+        <w:t xml:space="preserve">Improved email templates from actually using them</w:t>
+      </w:r>
+    </w:p>
+    <w:p>
+      <w:pPr>
+        <w:spacing w:after="120"/>
+        <w:ind w:left="720" w:hanging="360"/>
+        <w:rPr>
+          <w:sz w:val="24"/>
+          <w:szCs w:val="24"/>
+        </w:rPr>
+      </w:pPr>
+      <w:r>
+        <w:rPr>
+          <w:sz w:val="24"/>
+          <w:szCs w:val="24"/>
+        </w:rPr>
+        <w:t xml:space="preserve">Host communications running on schedule with a second person who can execute them</w:t>
+      </w:r>
+    </w:p>
+    <w:p>
+      <w:pPr>
+        <w:spacing w:after="120"/>
+        <w:ind w:left="720" w:hanging="360"/>
+        <w:rPr>
+          <w:sz w:val="24"/>
+          <w:szCs w:val="24"/>
+        </w:rPr>
+      </w:pPr>
+      <w:r>
+        <w:rPr>
+          <w:sz w:val="24"/>
+          <w:szCs w:val="24"/>
+        </w:rPr>
+        <w:t xml:space="preserve">Recommendations for expanding into Streams 2-4</w:t>
       </w:r>
     </w:p>
     <w:p>
@@ -543,75 +543,75 @@
           <w:sz w:val="24"/>
           <w:szCs w:val="24"/>
         </w:rPr>
-        <w:t xml:space="preserve">Once you're oriented, there's an immediate need to support the host pipeline as we head into the festival.</w:t>
-      </w:r>
-    </w:p>
-    <w:p>
-      <w:pPr>
-        <w:spacing w:after="120"/>
-        <w:ind w:left="720" w:hanging="360"/>
-        <w:rPr>
-          <w:sz w:val="24"/>
-          <w:szCs w:val="24"/>
-        </w:rPr>
-      </w:pPr>
-      <w:r>
-        <w:rPr>
-          <w:sz w:val="24"/>
-          <w:szCs w:val="24"/>
-        </w:rPr>
-        <w:t xml:space="preserve">•  Step into host communication support -- help manage the warm host and cool host outreach pipelines</w:t>
-      </w:r>
-    </w:p>
-    <w:p>
-      <w:pPr>
-        <w:spacing w:after="120"/>
-        <w:ind w:left="720" w:hanging="360"/>
-        <w:rPr>
-          <w:sz w:val="24"/>
-          <w:szCs w:val="24"/>
-        </w:rPr>
-      </w:pPr>
-      <w:r>
-        <w:rPr>
-          <w:sz w:val="24"/>
-          <w:szCs w:val="24"/>
-        </w:rPr>
-        <w:t xml:space="preserve">•  Design a routing map: what type of information goes where, who sees it, who doesn't</w:t>
-      </w:r>
-    </w:p>
-    <w:p>
-      <w:pPr>
-        <w:spacing w:after="120"/>
-        <w:ind w:left="720" w:hanging="360"/>
-        <w:rPr>
-          <w:sz w:val="24"/>
-          <w:szCs w:val="24"/>
-        </w:rPr>
-      </w:pPr>
-      <w:r>
-        <w:rPr>
-          <w:sz w:val="24"/>
-          <w:szCs w:val="24"/>
-        </w:rPr>
-        <w:t xml:space="preserve">•  Recommend improvements to our Google Spaces / email / shared inbox flow</w:t>
-      </w:r>
-    </w:p>
-    <w:p>
-      <w:pPr>
-        <w:spacing w:after="120"/>
-        <w:ind w:left="720" w:hanging="360"/>
-        <w:rPr>
-          <w:sz w:val="24"/>
-          <w:szCs w:val="24"/>
-        </w:rPr>
-      </w:pPr>
-      <w:r>
-        <w:rPr>
-          <w:sz w:val="24"/>
-          <w:szCs w:val="24"/>
-        </w:rPr>
-        <w:t xml:space="preserve">•  Build reusable templates: marketing asset requests, trailer reel specs, presenter guide handoffs</w:t>
+        <w:t xml:space="preserve">Once you're running Stream 1 confidently, there's an immediate need to expand into the other communication streams as the festival approaches.</w:t>
+      </w:r>
+    </w:p>
+    <w:p>
+      <w:pPr>
+        <w:spacing w:after="120"/>
+        <w:ind w:left="720" w:hanging="360"/>
+        <w:rPr>
+          <w:sz w:val="24"/>
+          <w:szCs w:val="24"/>
+        </w:rPr>
+      </w:pPr>
+      <w:r>
+        <w:rPr>
+          <w:sz w:val="24"/>
+          <w:szCs w:val="24"/>
+        </w:rPr>
+        <w:t xml:space="preserve">Take ownership of Streams 2-4: deliverables shipping, data collection forms, and host check-ins</w:t>
+      </w:r>
+    </w:p>
+    <w:p>
+      <w:pPr>
+        <w:spacing w:after="120"/>
+        <w:ind w:left="720" w:hanging="360"/>
+        <w:rPr>
+          <w:sz w:val="24"/>
+          <w:szCs w:val="24"/>
+        </w:rPr>
+      </w:pPr>
+      <w:r>
+        <w:rPr>
+          <w:sz w:val="24"/>
+          <w:szCs w:val="24"/>
+        </w:rPr>
+        <w:t xml:space="preserve">Turn your operator notes into a host comms playbook for the next person</w:t>
+      </w:r>
+    </w:p>
+    <w:p>
+      <w:pPr>
+        <w:spacing w:after="120"/>
+        <w:ind w:left="720" w:hanging="360"/>
+        <w:rPr>
+          <w:sz w:val="24"/>
+          <w:szCs w:val="24"/>
+        </w:rPr>
+      </w:pPr>
+      <w:r>
+        <w:rPr>
+          <w:sz w:val="24"/>
+          <w:szCs w:val="24"/>
+        </w:rPr>
+        <w:t xml:space="preserve">Recommend improvements to templates, cadence, and the dependency chain based on real experience</w:t>
+      </w:r>
+    </w:p>
+    <w:p>
+      <w:pPr>
+        <w:spacing w:after="120"/>
+        <w:ind w:left="720" w:hanging="360"/>
+        <w:rPr>
+          <w:sz w:val="24"/>
+          <w:szCs w:val="24"/>
+        </w:rPr>
+      </w:pPr>
+      <w:r>
+        <w:rPr>
+          <w:sz w:val="24"/>
+          <w:szCs w:val="24"/>
+        </w:rPr>
+        <w:t xml:space="preserve">Build reusable templates for any gaps you identified in Phase 1</w:t>
       </w:r>
     </w:p>
     <w:p>
@@ -1020,7 +1020,7 @@
           <w:sz w:val="24"/>
           <w:szCs w:val="24"/>
         </w:rPr>
-        <w:t xml:space="preserve">Phase 1 (knowledge base + onboarding): ~$600-800 (15-20 hours)</w:t>
+        <w:t xml:space="preserve">Phase 1 (host comms onboarding): ~$600-800 (15-20 hours)</w:t>
       </w:r>
     </w:p>
     <w:p>
@@ -1102,23 +1102,23 @@
           <w:sz w:val="24"/>
           <w:szCs w:val="24"/>
         </w:rPr>
-        <w:t xml:space="preserve">Everything you build here becomes the operational layer for every future festival cycle. You're not fixing one year's problems. You're designing the system that makes year 16, 17, 18 run without re-inventing the process each time.</w:t>
-      </w:r>
-    </w:p>
-    <w:p>
-      <w:pPr>
-        <w:spacing w:after="200"/>
-        <w:rPr>
-          <w:sz w:val="24"/>
-          <w:szCs w:val="24"/>
-        </w:rPr>
-      </w:pPr>
-      <w:r>
-        <w:rPr>
-          <w:sz w:val="24"/>
-          <w:szCs w:val="24"/>
-        </w:rPr>
-        <w:t xml:space="preserve">For your portfolio: this is a real organizational transformation project for a 15-year nonprofit navigating the transition from founder-driven operations to scalable, delegatable systems.</w:t>
+        <w:t xml:space="preserve">Everything you build here becomes the operational layer for every future festival cycle. You're not just sending emails for one year -- you're proving that the system works, improving it where it doesn't, and writing down what the next person needs to know.</w:t>
+      </w:r>
+    </w:p>
+    <w:p>
+      <w:pPr>
+        <w:spacing w:after="200"/>
+        <w:rPr>
+          <w:sz w:val="24"/>
+          <w:szCs w:val="24"/>
+        </w:rPr>
+      </w:pPr>
+      <w:r>
+        <w:rPr>
+          <w:sz w:val="24"/>
+          <w:szCs w:val="24"/>
+        </w:rPr>
+        <w:t xml:space="preserve">For your portfolio: this is real operational work for a 15-year nonprofit -- stepping into a system, running it, and making it better. The documentation you produce comes from doing, not from reading.</w:t>
       </w:r>
     </w:p>
     <w:p>

</xml_diff>